<commit_message>
7‑bit code table has been added
</commit_message>
<xml_diff>
--- a/CM_Lab2.docx
+++ b/CM_Lab2.docx
@@ -2141,11 +2141,6 @@
               <w14:ligatures w14:val="none"/>
             </w:rPr>
           </w:r>
-          <w:r>
-            <w:rPr>
-              <w14:ligatures w14:val="none"/>
-            </w:rPr>
-          </w:r>
         </w:p>
         <w:p>
           <w:pPr>
@@ -2160,7 +2155,6 @@
               <w14:ligatures w14:val="none"/>
             </w:rPr>
           </w:pPr>
-          <w:r/>
           <w:hyperlink w:tooltip="#_Toc2" w:anchor="_Toc2" w:history="1">
             <w:r>
               <w:rPr>
@@ -2201,11 +2195,6 @@
               <w14:ligatures w14:val="none"/>
             </w:rPr>
           </w:r>
-          <w:r>
-            <w:rPr>
-              <w14:ligatures w14:val="none"/>
-            </w:rPr>
-          </w:r>
         </w:p>
         <w:p>
           <w:pPr>
@@ -2221,7 +2210,6 @@
               <w14:ligatures w14:val="none"/>
             </w:rPr>
           </w:pPr>
-          <w:r/>
           <w:hyperlink w:tooltip="#_Toc3" w:anchor="_Toc3" w:history="1">
             <w:r>
               <w:rPr>
@@ -2262,12 +2250,6 @@
               <w14:ligatures w14:val="none"/>
             </w:rPr>
           </w:r>
-          <w:r>
-            <w:rPr>
-              <w:highlight w:val="none"/>
-              <w14:ligatures w14:val="none"/>
-            </w:rPr>
-          </w:r>
         </w:p>
         <w:p>
           <w:pPr>
@@ -2283,7 +2265,6 @@
               <w14:ligatures w14:val="none"/>
             </w:rPr>
           </w:pPr>
-          <w:r/>
           <w:hyperlink w:tooltip="#_Toc4" w:anchor="_Toc4" w:history="1">
             <w:r>
               <w:rPr>
@@ -2320,12 +2301,6 @@
               <w14:ligatures w14:val="none"/>
             </w:rPr>
           </w:r>
-          <w:r>
-            <w:rPr>
-              <w:highlight w:val="none"/>
-              <w14:ligatures w14:val="none"/>
-            </w:rPr>
-          </w:r>
         </w:p>
         <w:p>
           <w:pPr>
@@ -2340,7 +2315,6 @@
               <w:highlight w:val="none"/>
             </w:rPr>
           </w:pPr>
-          <w:r/>
           <w:hyperlink w:tooltip="#_Toc5" w:anchor="_Toc5" w:history="1">
             <w:r>
               <w:rPr>
@@ -2406,11 +2380,6 @@
               <w:highlight w:val="none"/>
             </w:rPr>
           </w:r>
-          <w:r>
-            <w:rPr>
-              <w:highlight w:val="none"/>
-            </w:rPr>
-          </w:r>
         </w:p>
         <w:p>
           <w:pPr>
@@ -2425,7 +2394,6 @@
               <w14:ligatures w14:val="none"/>
             </w:rPr>
           </w:pPr>
-          <w:r/>
           <w:hyperlink w:tooltip="#_Toc6" w:anchor="_Toc6" w:history="1">
             <w:r>
               <w:rPr>
@@ -2466,15 +2434,10 @@
               <w:fldChar w:fldCharType="begin"/>
               <w:instrText xml:space="preserve">PAGEREF _Toc6 \h</w:instrText>
               <w:fldChar w:fldCharType="separate"/>
-              <w:t xml:space="preserve">6</w:t>
+              <w:t xml:space="preserve">7</w:t>
               <w:fldChar w:fldCharType="end"/>
             </w:r>
           </w:hyperlink>
-          <w:r>
-            <w:rPr>
-              <w14:ligatures w14:val="none"/>
-            </w:rPr>
-          </w:r>
           <w:r>
             <w:rPr>
               <w14:ligatures w14:val="none"/>
@@ -2494,14 +2457,12 @@
               <w:highlight w:val="none"/>
             </w:rPr>
           </w:pPr>
+          <w:r/>
           <w:r>
             <w:fldChar w:fldCharType="end"/>
           </w:r>
-          <w:r>
-            <w:rPr>
-              <w:highlight w:val="none"/>
-            </w:rPr>
-          </w:r>
+          <w:r/>
+          <w:r/>
         </w:p>
       </w:sdtContent>
     </w:sdt>
@@ -2554,12 +2515,9 @@
       <w:r>
         <w:t xml:space="preserve">Цель работы и задание</w:t>
       </w:r>
+      <w:r/>
       <w:bookmarkEnd w:id="1"/>
-      <w:r>
-        <w:rPr>
-          <w14:ligatures w14:val="none"/>
-        </w:rPr>
-      </w:r>
+      <w:r/>
       <w:r>
         <w:rPr>
           <w14:ligatures w14:val="none"/>
@@ -2585,6 +2543,7 @@
         <w:rPr>
           <w:highlight w:val="none"/>
           <w:lang w:val="ru-RU"/>
+          <w14:ligatures w14:val="none"/>
         </w:rPr>
       </w:r>
       <w:r>
@@ -2613,12 +2572,9 @@
       <w:r>
         <w:t xml:space="preserve">тветы на контрольные вопросы</w:t>
       </w:r>
+      <w:r/>
       <w:bookmarkEnd w:id="2"/>
-      <w:r>
-        <w:rPr>
-          <w14:ligatures w14:val="none"/>
-        </w:rPr>
-      </w:r>
+      <w:r/>
       <w:r>
         <w:rPr>
           <w14:ligatures w14:val="none"/>
@@ -2733,7 +2689,8 @@
       </w:r>
       <w:r>
         <w:rPr>
-          <w:highlight w:val="none"/>
+          <w:highlight w:val="yellow"/>
+          <w14:ligatures w14:val="none"/>
         </w:rPr>
       </w:r>
       <w:r>
@@ -2769,7 +2726,7 @@
           <w:color w:val="000000"/>
           <w:sz w:val="28"/>
           <w:szCs w:val="28"/>
-          <w:highlight w:val="none"/>
+          <w:highlight w:val="yellow"/>
         </w:rPr>
       </w:r>
       <w:r>
@@ -2923,10 +2880,8 @@
       </w:r>
       <w:r>
         <w:rPr>
-          <w:color w:val="000000"/>
-          <w:sz w:val="28"/>
-          <w:szCs w:val="28"/>
-          <w:highlight w:val="yellow"/>
+          <w:highlight w:val="none"/>
+          <w:lang w:val="ru-RU"/>
         </w:rPr>
       </w:r>
       <w:r>
@@ -2996,14 +2951,9 @@
         </w:rPr>
         <w:t xml:space="preserve">3. Блок-схема учебной программы</w:t>
       </w:r>
+      <w:r/>
       <w:bookmarkEnd w:id="3"/>
-      <w:r>
-        <w:rPr>
-          <w:highlight w:val="none"/>
-          <w:lang w:val="ru-RU"/>
-          <w14:ligatures w14:val="none"/>
-        </w:rPr>
-      </w:r>
+      <w:r/>
       <w:r>
         <w:rPr>
           <w:highlight w:val="none"/>
@@ -3174,7 +3124,7 @@
       <w:r>
         <w:rPr>
           <w:highlight w:val="none"/>
-          <w:lang w:val="ru-RU"/>
+          <w:lang w:val="ru-RU" w:bidi="ru-RU"/>
         </w:rPr>
       </w:r>
       <w:r>
@@ -3248,7 +3198,7 @@
       <w:r>
         <w:rPr>
           <w:highlight w:val="none"/>
-          <w:lang w:val="ru-RU" w:bidi="ru-RU"/>
+          <w:lang w:val="ru-RU"/>
         </w:rPr>
       </w:r>
       <w:r>
@@ -3301,13 +3251,9 @@
       <w:r>
         <w:t xml:space="preserve">4. Ассемблерный код учебной программы</w:t>
       </w:r>
+      <w:r/>
       <w:bookmarkEnd w:id="4"/>
-      <w:r>
-        <w:rPr>
-          <w:highlight w:val="none"/>
-          <w14:ligatures w14:val="none"/>
-        </w:rPr>
-      </w:r>
+      <w:r/>
       <w:r>
         <w:rPr>
           <w:highlight w:val="none"/>
@@ -3642,6 +3588,7 @@
             </w:r>
             <w:r>
               <w:rPr>
+                <w:rFonts w:ascii="Courier New" w:hAnsi="Courier New" w:eastAsia="Courier New" w:cs="Courier New"/>
                 <w:sz w:val="24"/>
                 <w:szCs w:val="24"/>
                 <w:highlight w:val="none"/>
@@ -5048,11 +4995,10 @@
             </w:r>
             <w:r>
               <w:rPr>
-                <w:rFonts w:ascii="Courier New" w:hAnsi="Courier New" w:eastAsia="Courier New" w:cs="Courier New"/>
+                <w:rFonts w:ascii="Courier New" w:hAnsi="Courier New" w:cs="Courier New"/>
                 <w:sz w:val="24"/>
                 <w:szCs w:val="24"/>
                 <w:highlight w:val="none"/>
-                <w:lang w:val="ru-RU"/>
               </w:rPr>
             </w:r>
             <w:r>
@@ -5251,7 +5197,6 @@
               </w:rPr>
               <w:t xml:space="preserve">//</w:t>
             </w:r>
-            <w:r/>
             <w:r>
               <w:rPr>
                 <w:sz w:val="24"/>
@@ -5389,14 +5334,9 @@
         </w:rPr>
         <w:t xml:space="preserve"> работы на ПК (в комплексном режиме)</w:t>
       </w:r>
+      <w:r/>
       <w:bookmarkEnd w:id="5"/>
-      <w:r>
-        <w:rPr>
-          <w:sz w:val="28"/>
-          <w:szCs w:val="28"/>
-          <w:highlight w:val="none"/>
-        </w:rPr>
-      </w:r>
+      <w:r/>
       <w:r>
         <w:rPr>
           <w:sz w:val="28"/>
@@ -6440,8 +6380,6 @@
           <w:color w:val="000000"/>
           <w:sz w:val="28"/>
           <w:szCs w:val="28"/>
-          <w:highlight w:val="none"/>
-          <w:lang w:val="en-US"/>
         </w:rPr>
       </w:r>
       <w:r>
@@ -6497,6 +6435,8 @@
           <w:color w:val="000000"/>
           <w:sz w:val="28"/>
           <w:szCs w:val="28"/>
+          <w:highlight w:val="none"/>
+          <w:lang w:val="en-US"/>
         </w:rPr>
       </w:r>
       <w:r>
@@ -6945,6 +6885,7 @@
           <w:color w:val="000000"/>
           <w:sz w:val="28"/>
           <w:szCs w:val="28"/>
+          <w:highlight w:val="none"/>
         </w:rPr>
       </w:pPr>
       <w:r>
@@ -7071,6 +7012,1095 @@
       <w:pPr>
         <w:pBdr/>
         <w:spacing w:line="312" w:lineRule="auto"/>
+        <w:ind w:right="0" w:firstLine="709" w:left="0"/>
+        <w:rPr>
+          <w:color w:val="000000"/>
+          <w:sz w:val="28"/>
+          <w:szCs w:val="28"/>
+        </w:rPr>
+      </w:pPr>
+      <w:r>
+        <w:rPr>
+          <w:color w:val="000000"/>
+          <w:sz w:val="28"/>
+          <w:szCs w:val="28"/>
+        </w:rPr>
+      </w:r>
+      <w:r>
+        <w:rPr>
+          <w:color w:val="000000"/>
+          <w:sz w:val="28"/>
+          <w:szCs w:val="28"/>
+        </w:rPr>
+      </w:r>
+      <w:r>
+        <w:rPr>
+          <w:color w:val="000000"/>
+          <w:sz w:val="28"/>
+          <w:szCs w:val="28"/>
+        </w:rPr>
+      </w:r>
+    </w:p>
+    <w:p>
+      <w:pPr>
+        <w:pBdr/>
+        <w:spacing w:line="312" w:lineRule="auto"/>
+        <w:ind w:right="0" w:firstLine="709" w:left="0"/>
+        <w:rPr>
+          <w:color w:val="000000"/>
+          <w:sz w:val="28"/>
+          <w:szCs w:val="28"/>
+          <w:highlight w:val="none"/>
+        </w:rPr>
+      </w:pPr>
+      <w:r>
+        <w:rPr>
+          <w:color w:val="000000"/>
+          <w:sz w:val="28"/>
+          <w:szCs w:val="28"/>
+          <w:highlight w:val="none"/>
+        </w:rPr>
+        <w:t xml:space="preserve">Коды символов арабских цифр представлены в таблице 3.</w:t>
+      </w:r>
+      <w:r>
+        <w:rPr>
+          <w:color w:val="000000"/>
+          <w:sz w:val="28"/>
+          <w:szCs w:val="28"/>
+        </w:rPr>
+      </w:r>
+      <w:r>
+        <w:rPr>
+          <w:color w:val="000000"/>
+          <w:sz w:val="28"/>
+          <w:szCs w:val="28"/>
+          <w:highlight w:val="none"/>
+        </w:rPr>
+      </w:r>
+    </w:p>
+    <w:p>
+      <w:pPr>
+        <w:pBdr/>
+        <w:spacing w:line="312" w:lineRule="auto"/>
+        <w:ind w:right="0" w:firstLine="709" w:left="0"/>
+        <w:rPr>
+          <w:color w:val="000000"/>
+          <w:sz w:val="28"/>
+          <w:szCs w:val="28"/>
+          <w:highlight w:val="none"/>
+        </w:rPr>
+      </w:pPr>
+      <w:r>
+        <w:rPr>
+          <w:color w:val="000000"/>
+          <w:sz w:val="28"/>
+          <w:szCs w:val="28"/>
+          <w:highlight w:val="none"/>
+        </w:rPr>
+      </w:r>
+      <w:r>
+        <w:rPr>
+          <w:color w:val="000000"/>
+          <w:sz w:val="28"/>
+          <w:szCs w:val="28"/>
+          <w:highlight w:val="none"/>
+        </w:rPr>
+      </w:r>
+      <w:r>
+        <w:rPr>
+          <w:color w:val="000000"/>
+          <w:sz w:val="28"/>
+          <w:szCs w:val="28"/>
+          <w:highlight w:val="none"/>
+        </w:rPr>
+      </w:r>
+    </w:p>
+    <w:p>
+      <w:pPr>
+        <w:pBdr/>
+        <w:spacing w:line="312" w:lineRule="auto"/>
+        <w:ind w:right="0" w:firstLine="0" w:left="0"/>
+        <w:rPr>
+          <w:color w:val="000000"/>
+          <w:sz w:val="28"/>
+          <w:szCs w:val="28"/>
+          <w:highlight w:val="none"/>
+        </w:rPr>
+      </w:pPr>
+      <w:r>
+        <w:rPr>
+          <w:color w:val="000000"/>
+          <w:sz w:val="28"/>
+          <w:szCs w:val="28"/>
+          <w:highlight w:val="none"/>
+          <w:lang w:val="ru-RU"/>
+        </w:rPr>
+        <w:t xml:space="preserve">Таблица 3 – Коды символов арабских цифр</w:t>
+      </w:r>
+      <w:r>
+        <w:rPr>
+          <w:color w:val="000000"/>
+          <w:sz w:val="28"/>
+          <w:szCs w:val="28"/>
+          <w:highlight w:val="none"/>
+        </w:rPr>
+      </w:r>
+    </w:p>
+    <w:tbl>
+      <w:tblPr>
+        <w:tblStyle w:val="783"/>
+        <w:tblInd w:w="6" w:type="dxa"/>
+        <w:tblW w:w="0" w:type="auto"/>
+        <w:tblBorders/>
+        <w:tblLayout w:type="fixed"/>
+        <w:tblLook w:val="04A0" w:firstRow="1" w:lastRow="0" w:firstColumn="1" w:lastColumn="0" w:noHBand="0" w:noVBand="1"/>
+      </w:tblPr>
+      <w:tblGrid>
+        <w:gridCol w:w="2416"/>
+        <w:gridCol w:w="7053"/>
+      </w:tblGrid>
+      <w:tr>
+        <w:trPr/>
+        <w:tc>
+          <w:tcPr>
+            <w:tcBorders/>
+            <w:tcW w:w="2416" w:type="dxa"/>
+          </w:tcPr>
+          <w:p>
+            <w:pPr>
+              <w:pBdr/>
+              <w:spacing w:line="312" w:lineRule="auto"/>
+              <w:ind w:right="0" w:firstLine="0" w:left="0"/>
+              <w:jc w:val="center"/>
+              <w:rPr>
+                <w:color w:val="000000"/>
+                <w:sz w:val="28"/>
+                <w:szCs w:val="28"/>
+                <w:highlight w:val="none"/>
+              </w:rPr>
+            </w:pPr>
+            <w:r>
+              <w:rPr>
+                <w:color w:val="000000"/>
+                <w:sz w:val="28"/>
+                <w:szCs w:val="28"/>
+                <w:highlight w:val="none"/>
+              </w:rPr>
+              <w:t xml:space="preserve">Цифра</w:t>
+            </w:r>
+            <w:r>
+              <w:rPr>
+                <w:color w:val="000000"/>
+                <w:sz w:val="28"/>
+                <w:szCs w:val="28"/>
+                <w:highlight w:val="none"/>
+              </w:rPr>
+            </w:r>
+          </w:p>
+        </w:tc>
+        <w:tc>
+          <w:tcPr>
+            <w:tcBorders/>
+            <w:tcW w:w="7053" w:type="dxa"/>
+          </w:tcPr>
+          <w:p>
+            <w:pPr>
+              <w:pBdr/>
+              <w:tabs>
+                <w:tab w:val="left" w:leader="none" w:pos="6945"/>
+              </w:tabs>
+              <w:spacing w:line="312" w:lineRule="auto"/>
+              <w:ind w:right="0" w:firstLine="0" w:left="0"/>
+              <w:jc w:val="center"/>
+              <w:rPr>
+                <w:color w:val="000000"/>
+                <w:sz w:val="28"/>
+                <w:szCs w:val="28"/>
+                <w:highlight w:val="none"/>
+              </w:rPr>
+            </w:pPr>
+            <w:r>
+              <w:rPr>
+                <w:color w:val="000000"/>
+                <w:sz w:val="28"/>
+                <w:szCs w:val="28"/>
+                <w:highlight w:val="none"/>
+              </w:rPr>
+              <w:t xml:space="preserve">Код КОИ-7</w:t>
+            </w:r>
+            <w:r>
+              <w:rPr>
+                <w:color w:val="000000"/>
+                <w:sz w:val="28"/>
+                <w:szCs w:val="28"/>
+                <w:highlight w:val="none"/>
+              </w:rPr>
+            </w:r>
+          </w:p>
+        </w:tc>
+      </w:tr>
+      <w:tr>
+        <w:trPr/>
+        <w:tc>
+          <w:tcPr>
+            <w:tcBorders/>
+            <w:tcW w:w="2416" w:type="dxa"/>
+            <w:vMerge w:val="restart"/>
+          </w:tcPr>
+          <w:p>
+            <w:pPr>
+              <w:pBdr/>
+              <w:spacing w:line="312" w:lineRule="auto"/>
+              <w:ind w:right="0" w:firstLine="0" w:left="0"/>
+              <w:jc w:val="center"/>
+              <w:rPr>
+                <w:color w:val="000000"/>
+                <w:sz w:val="28"/>
+                <w:szCs w:val="28"/>
+                <w:highlight w:val="none"/>
+              </w:rPr>
+            </w:pPr>
+            <w:r>
+              <w:rPr>
+                <w:color w:val="000000"/>
+                <w:sz w:val="28"/>
+                <w:szCs w:val="28"/>
+                <w:highlight w:val="none"/>
+              </w:rPr>
+              <w:t xml:space="preserve">0</w:t>
+            </w:r>
+            <w:r>
+              <w:rPr>
+                <w:color w:val="000000"/>
+                <w:sz w:val="28"/>
+                <w:szCs w:val="28"/>
+                <w:highlight w:val="none"/>
+              </w:rPr>
+            </w:r>
+          </w:p>
+        </w:tc>
+        <w:tc>
+          <w:tcPr>
+            <w:tcBorders/>
+            <w:tcW w:w="7053" w:type="dxa"/>
+            <w:vMerge w:val="restart"/>
+          </w:tcPr>
+          <w:p>
+            <w:pPr>
+              <w:pBdr/>
+              <w:spacing w:line="312" w:lineRule="auto"/>
+              <w:ind w:right="0" w:firstLine="0" w:left="0"/>
+              <w:jc w:val="center"/>
+              <w:rPr>
+                <w:color w:val="000000"/>
+                <w:sz w:val="28"/>
+                <w:szCs w:val="28"/>
+                <w:highlight w:val="none"/>
+              </w:rPr>
+            </w:pPr>
+            <w:r>
+              <w:rPr>
+                <w:color w:val="000000"/>
+                <w:sz w:val="28"/>
+                <w:szCs w:val="28"/>
+                <w:highlight w:val="none"/>
+              </w:rPr>
+              <w:t xml:space="preserve">0</w:t>
+            </w:r>
+            <w:r>
+              <w:rPr>
+                <w:color w:val="000000"/>
+                <w:sz w:val="28"/>
+                <w:szCs w:val="28"/>
+                <w:highlight w:val="none"/>
+                <w:lang w:val="en-US"/>
+              </w:rPr>
+              <w:t xml:space="preserve">x30</w:t>
+            </w:r>
+            <w:r>
+              <w:rPr>
+                <w:color w:val="000000"/>
+                <w:sz w:val="28"/>
+                <w:szCs w:val="28"/>
+                <w:highlight w:val="none"/>
+              </w:rPr>
+            </w:r>
+          </w:p>
+        </w:tc>
+      </w:tr>
+      <w:tr>
+        <w:trPr/>
+        <w:tc>
+          <w:tcPr>
+            <w:tcBorders/>
+            <w:tcW w:w="2416" w:type="dxa"/>
+          </w:tcPr>
+          <w:p>
+            <w:pPr>
+              <w:pBdr/>
+              <w:spacing w:line="312" w:lineRule="auto"/>
+              <w:ind w:right="0" w:firstLine="0" w:left="0"/>
+              <w:jc w:val="center"/>
+              <w:rPr>
+                <w:color w:val="000000"/>
+                <w:sz w:val="28"/>
+                <w:szCs w:val="28"/>
+                <w:highlight w:val="none"/>
+              </w:rPr>
+            </w:pPr>
+            <w:r>
+              <w:rPr>
+                <w:color w:val="000000"/>
+                <w:sz w:val="28"/>
+                <w:szCs w:val="28"/>
+                <w:highlight w:val="none"/>
+              </w:rPr>
+              <w:t xml:space="preserve">1</w:t>
+            </w:r>
+            <w:r>
+              <w:rPr>
+                <w:color w:val="000000"/>
+                <w:sz w:val="28"/>
+                <w:szCs w:val="28"/>
+                <w:highlight w:val="none"/>
+              </w:rPr>
+            </w:r>
+          </w:p>
+        </w:tc>
+        <w:tc>
+          <w:tcPr>
+            <w:tcBorders/>
+            <w:tcW w:w="7053" w:type="dxa"/>
+          </w:tcPr>
+          <w:p>
+            <w:pPr>
+              <w:pBdr/>
+              <w:spacing w:line="312" w:lineRule="auto"/>
+              <w:ind w:right="0" w:firstLine="0" w:left="0"/>
+              <w:jc w:val="center"/>
+              <w:rPr>
+                <w:color w:val="000000"/>
+                <w:sz w:val="28"/>
+                <w:szCs w:val="28"/>
+                <w:highlight w:val="none"/>
+              </w:rPr>
+            </w:pPr>
+            <w:r>
+              <w:rPr>
+                <w:color w:val="000000"/>
+                <w:sz w:val="28"/>
+                <w:szCs w:val="28"/>
+                <w:highlight w:val="none"/>
+                <w:lang w:val="en-US"/>
+              </w:rPr>
+              <w:t xml:space="preserve">0x31</w:t>
+            </w:r>
+            <w:r>
+              <w:rPr>
+                <w:color w:val="000000"/>
+                <w:sz w:val="28"/>
+                <w:szCs w:val="28"/>
+                <w:highlight w:val="none"/>
+              </w:rPr>
+            </w:r>
+          </w:p>
+        </w:tc>
+      </w:tr>
+      <w:tr>
+        <w:trPr/>
+        <w:tc>
+          <w:tcPr>
+            <w:tcBorders/>
+            <w:tcW w:w="2416" w:type="dxa"/>
+          </w:tcPr>
+          <w:p>
+            <w:pPr>
+              <w:pBdr/>
+              <w:spacing w:line="312" w:lineRule="auto"/>
+              <w:ind w:right="0" w:firstLine="0" w:left="0"/>
+              <w:jc w:val="center"/>
+              <w:rPr>
+                <w:color w:val="000000"/>
+                <w:sz w:val="28"/>
+                <w:szCs w:val="28"/>
+                <w:highlight w:val="none"/>
+              </w:rPr>
+            </w:pPr>
+            <w:r>
+              <w:rPr>
+                <w:color w:val="000000"/>
+                <w:sz w:val="28"/>
+                <w:szCs w:val="28"/>
+                <w:highlight w:val="none"/>
+              </w:rPr>
+              <w:t xml:space="preserve">2</w:t>
+            </w:r>
+            <w:r>
+              <w:rPr>
+                <w:color w:val="000000"/>
+                <w:sz w:val="28"/>
+                <w:szCs w:val="28"/>
+                <w:highlight w:val="none"/>
+              </w:rPr>
+            </w:r>
+          </w:p>
+        </w:tc>
+        <w:tc>
+          <w:tcPr>
+            <w:tcBorders/>
+            <w:tcW w:w="7053" w:type="dxa"/>
+          </w:tcPr>
+          <w:p>
+            <w:pPr>
+              <w:pBdr/>
+              <w:spacing w:line="312" w:lineRule="auto"/>
+              <w:ind w:right="0" w:firstLine="0" w:left="0"/>
+              <w:jc w:val="center"/>
+              <w:rPr>
+                <w:color w:val="000000"/>
+                <w:sz w:val="28"/>
+                <w:szCs w:val="28"/>
+                <w:highlight w:val="none"/>
+              </w:rPr>
+            </w:pPr>
+            <w:r>
+              <w:rPr>
+                <w:color w:val="000000"/>
+                <w:sz w:val="28"/>
+                <w:szCs w:val="28"/>
+                <w:highlight w:val="none"/>
+                <w:lang w:val="en-US"/>
+              </w:rPr>
+              <w:t xml:space="preserve">0x32</w:t>
+            </w:r>
+            <w:r>
+              <w:rPr>
+                <w:color w:val="000000"/>
+                <w:sz w:val="28"/>
+                <w:szCs w:val="28"/>
+                <w:highlight w:val="none"/>
+              </w:rPr>
+            </w:r>
+          </w:p>
+        </w:tc>
+      </w:tr>
+      <w:tr>
+        <w:trPr/>
+        <w:tc>
+          <w:tcPr>
+            <w:tcBorders/>
+            <w:tcW w:w="2416" w:type="dxa"/>
+          </w:tcPr>
+          <w:p>
+            <w:pPr>
+              <w:pBdr/>
+              <w:spacing w:line="312" w:lineRule="auto"/>
+              <w:ind w:right="0" w:firstLine="0" w:left="0"/>
+              <w:jc w:val="center"/>
+              <w:rPr>
+                <w:color w:val="000000"/>
+                <w:sz w:val="28"/>
+                <w:szCs w:val="28"/>
+                <w:highlight w:val="none"/>
+              </w:rPr>
+            </w:pPr>
+            <w:r>
+              <w:rPr>
+                <w:color w:val="000000"/>
+                <w:sz w:val="28"/>
+                <w:szCs w:val="28"/>
+                <w:highlight w:val="none"/>
+              </w:rPr>
+              <w:t xml:space="preserve">3</w:t>
+            </w:r>
+            <w:r>
+              <w:rPr>
+                <w:color w:val="000000"/>
+                <w:sz w:val="28"/>
+                <w:szCs w:val="28"/>
+                <w:highlight w:val="none"/>
+              </w:rPr>
+            </w:r>
+          </w:p>
+        </w:tc>
+        <w:tc>
+          <w:tcPr>
+            <w:tcBorders/>
+            <w:tcW w:w="7053" w:type="dxa"/>
+          </w:tcPr>
+          <w:p>
+            <w:pPr>
+              <w:pBdr/>
+              <w:spacing w:line="312" w:lineRule="auto"/>
+              <w:ind w:right="0" w:firstLine="0" w:left="0"/>
+              <w:jc w:val="center"/>
+              <w:rPr>
+                <w:color w:val="000000"/>
+                <w:sz w:val="28"/>
+                <w:szCs w:val="28"/>
+                <w:highlight w:val="none"/>
+              </w:rPr>
+            </w:pPr>
+            <w:r>
+              <w:rPr>
+                <w:color w:val="000000"/>
+                <w:sz w:val="28"/>
+                <w:szCs w:val="28"/>
+                <w:highlight w:val="none"/>
+                <w:lang w:val="en-US"/>
+              </w:rPr>
+              <w:t xml:space="preserve">0x33</w:t>
+            </w:r>
+            <w:r>
+              <w:rPr>
+                <w:color w:val="000000"/>
+                <w:sz w:val="28"/>
+                <w:szCs w:val="28"/>
+                <w:highlight w:val="none"/>
+              </w:rPr>
+            </w:r>
+          </w:p>
+        </w:tc>
+      </w:tr>
+      <w:tr>
+        <w:trPr/>
+        <w:tc>
+          <w:tcPr>
+            <w:tcBorders/>
+            <w:tcW w:w="2416" w:type="dxa"/>
+          </w:tcPr>
+          <w:p>
+            <w:pPr>
+              <w:pBdr/>
+              <w:spacing w:line="312" w:lineRule="auto"/>
+              <w:ind w:right="0" w:firstLine="0" w:left="0"/>
+              <w:jc w:val="center"/>
+              <w:rPr>
+                <w:color w:val="000000"/>
+                <w:sz w:val="28"/>
+                <w:szCs w:val="28"/>
+                <w:highlight w:val="none"/>
+              </w:rPr>
+            </w:pPr>
+            <w:r>
+              <w:rPr>
+                <w:color w:val="000000"/>
+                <w:sz w:val="28"/>
+                <w:szCs w:val="28"/>
+                <w:highlight w:val="none"/>
+              </w:rPr>
+              <w:t xml:space="preserve">4</w:t>
+            </w:r>
+            <w:r>
+              <w:rPr>
+                <w:color w:val="000000"/>
+                <w:sz w:val="28"/>
+                <w:szCs w:val="28"/>
+                <w:highlight w:val="none"/>
+              </w:rPr>
+            </w:r>
+          </w:p>
+        </w:tc>
+        <w:tc>
+          <w:tcPr>
+            <w:tcBorders/>
+            <w:tcW w:w="7053" w:type="dxa"/>
+          </w:tcPr>
+          <w:p>
+            <w:pPr>
+              <w:pBdr/>
+              <w:spacing w:line="312" w:lineRule="auto"/>
+              <w:ind w:right="0" w:firstLine="0" w:left="0"/>
+              <w:jc w:val="center"/>
+              <w:rPr>
+                <w:color w:val="000000"/>
+                <w:sz w:val="28"/>
+                <w:szCs w:val="28"/>
+                <w:highlight w:val="none"/>
+              </w:rPr>
+            </w:pPr>
+            <w:r>
+              <w:rPr>
+                <w:color w:val="000000"/>
+                <w:sz w:val="28"/>
+                <w:szCs w:val="28"/>
+                <w:highlight w:val="none"/>
+                <w:lang w:val="en-US"/>
+              </w:rPr>
+              <w:t xml:space="preserve">0x34</w:t>
+            </w:r>
+            <w:r>
+              <w:rPr>
+                <w:color w:val="000000"/>
+                <w:sz w:val="28"/>
+                <w:szCs w:val="28"/>
+                <w:highlight w:val="none"/>
+              </w:rPr>
+            </w:r>
+          </w:p>
+        </w:tc>
+      </w:tr>
+      <w:tr>
+        <w:trPr/>
+        <w:tc>
+          <w:tcPr>
+            <w:tcBorders/>
+            <w:tcW w:w="2416" w:type="dxa"/>
+          </w:tcPr>
+          <w:p>
+            <w:pPr>
+              <w:pBdr/>
+              <w:spacing w:line="312" w:lineRule="auto"/>
+              <w:ind w:right="0" w:firstLine="0" w:left="0"/>
+              <w:jc w:val="center"/>
+              <w:rPr>
+                <w:color w:val="000000"/>
+                <w:sz w:val="28"/>
+                <w:szCs w:val="28"/>
+                <w:highlight w:val="none"/>
+              </w:rPr>
+            </w:pPr>
+            <w:r>
+              <w:rPr>
+                <w:color w:val="000000"/>
+                <w:sz w:val="28"/>
+                <w:szCs w:val="28"/>
+                <w:highlight w:val="none"/>
+              </w:rPr>
+              <w:t xml:space="preserve">5</w:t>
+            </w:r>
+            <w:r>
+              <w:rPr>
+                <w:color w:val="000000"/>
+                <w:sz w:val="28"/>
+                <w:szCs w:val="28"/>
+                <w:highlight w:val="none"/>
+              </w:rPr>
+            </w:r>
+          </w:p>
+        </w:tc>
+        <w:tc>
+          <w:tcPr>
+            <w:tcBorders/>
+            <w:tcW w:w="7053" w:type="dxa"/>
+          </w:tcPr>
+          <w:p>
+            <w:pPr>
+              <w:pBdr/>
+              <w:spacing w:line="312" w:lineRule="auto"/>
+              <w:ind w:right="0" w:firstLine="0" w:left="0"/>
+              <w:jc w:val="center"/>
+              <w:rPr>
+                <w:color w:val="000000"/>
+                <w:sz w:val="28"/>
+                <w:szCs w:val="28"/>
+                <w:highlight w:val="none"/>
+              </w:rPr>
+            </w:pPr>
+            <w:r>
+              <w:rPr>
+                <w:color w:val="000000"/>
+                <w:sz w:val="28"/>
+                <w:szCs w:val="28"/>
+                <w:highlight w:val="none"/>
+                <w:lang w:val="en-US"/>
+              </w:rPr>
+              <w:t xml:space="preserve">0x35</w:t>
+            </w:r>
+            <w:r>
+              <w:rPr>
+                <w:color w:val="000000"/>
+                <w:sz w:val="28"/>
+                <w:szCs w:val="28"/>
+                <w:highlight w:val="none"/>
+              </w:rPr>
+            </w:r>
+            <w:r>
+              <w:rPr>
+                <w:color w:val="000000"/>
+                <w:sz w:val="28"/>
+                <w:szCs w:val="28"/>
+                <w:highlight w:val="none"/>
+              </w:rPr>
+            </w:r>
+            <w:r>
+              <w:rPr>
+                <w:color w:val="000000"/>
+                <w:sz w:val="28"/>
+                <w:szCs w:val="28"/>
+                <w:highlight w:val="none"/>
+              </w:rPr>
+            </w:r>
+            <w:r>
+              <w:rPr>
+                <w:color w:val="000000"/>
+                <w:sz w:val="28"/>
+                <w:szCs w:val="28"/>
+                <w:highlight w:val="none"/>
+              </w:rPr>
+            </w:r>
+          </w:p>
+        </w:tc>
+      </w:tr>
+      <w:tr>
+        <w:trPr>
+          <w:trHeight w:val="410"/>
+        </w:trPr>
+        <w:tc>
+          <w:tcPr>
+            <w:tcBorders/>
+            <w:tcW w:w="2416" w:type="dxa"/>
+          </w:tcPr>
+          <w:p>
+            <w:pPr>
+              <w:pBdr/>
+              <w:spacing w:line="312" w:lineRule="auto"/>
+              <w:ind w:right="0" w:firstLine="0" w:left="0"/>
+              <w:jc w:val="center"/>
+              <w:rPr>
+                <w:color w:val="000000"/>
+                <w:sz w:val="28"/>
+                <w:szCs w:val="28"/>
+                <w:highlight w:val="none"/>
+              </w:rPr>
+            </w:pPr>
+            <w:r>
+              <w:rPr>
+                <w:color w:val="000000"/>
+                <w:sz w:val="28"/>
+                <w:szCs w:val="28"/>
+                <w:highlight w:val="none"/>
+              </w:rPr>
+              <w:t xml:space="preserve">6</w:t>
+            </w:r>
+            <w:r>
+              <w:rPr>
+                <w:color w:val="000000"/>
+                <w:sz w:val="28"/>
+                <w:szCs w:val="28"/>
+                <w:highlight w:val="none"/>
+              </w:rPr>
+            </w:r>
+          </w:p>
+        </w:tc>
+        <w:tc>
+          <w:tcPr>
+            <w:tcBorders/>
+            <w:tcW w:w="7053" w:type="dxa"/>
+          </w:tcPr>
+          <w:p>
+            <w:pPr>
+              <w:pBdr/>
+              <w:spacing w:line="312" w:lineRule="auto"/>
+              <w:ind w:right="0" w:firstLine="0" w:left="0"/>
+              <w:jc w:val="center"/>
+              <w:rPr>
+                <w:color w:val="000000"/>
+                <w:sz w:val="28"/>
+                <w:szCs w:val="28"/>
+                <w:highlight w:val="none"/>
+              </w:rPr>
+            </w:pPr>
+            <w:r>
+              <w:rPr>
+                <w:color w:val="000000"/>
+                <w:sz w:val="28"/>
+                <w:szCs w:val="28"/>
+                <w:highlight w:val="none"/>
+                <w:lang w:val="en-US"/>
+              </w:rPr>
+              <w:t xml:space="preserve">0x36</w:t>
+            </w:r>
+            <w:r>
+              <w:rPr>
+                <w:color w:val="000000"/>
+                <w:sz w:val="28"/>
+                <w:szCs w:val="28"/>
+                <w:highlight w:val="none"/>
+              </w:rPr>
+            </w:r>
+          </w:p>
+        </w:tc>
+      </w:tr>
+      <w:tr>
+        <w:trPr/>
+        <w:tc>
+          <w:tcPr>
+            <w:tcBorders/>
+            <w:tcW w:w="2416" w:type="dxa"/>
+          </w:tcPr>
+          <w:p>
+            <w:pPr>
+              <w:pBdr/>
+              <w:spacing w:line="312" w:lineRule="auto"/>
+              <w:ind w:right="0" w:firstLine="0" w:left="0"/>
+              <w:jc w:val="center"/>
+              <w:rPr>
+                <w:color w:val="000000"/>
+                <w:sz w:val="28"/>
+                <w:szCs w:val="28"/>
+                <w:highlight w:val="none"/>
+              </w:rPr>
+            </w:pPr>
+            <w:r>
+              <w:rPr>
+                <w:color w:val="000000"/>
+                <w:sz w:val="28"/>
+                <w:szCs w:val="28"/>
+                <w:highlight w:val="none"/>
+              </w:rPr>
+              <w:t xml:space="preserve">7</w:t>
+            </w:r>
+            <w:r>
+              <w:rPr>
+                <w:color w:val="000000"/>
+                <w:sz w:val="28"/>
+                <w:szCs w:val="28"/>
+                <w:highlight w:val="none"/>
+              </w:rPr>
+            </w:r>
+          </w:p>
+        </w:tc>
+        <w:tc>
+          <w:tcPr>
+            <w:tcBorders/>
+            <w:tcW w:w="7053" w:type="dxa"/>
+          </w:tcPr>
+          <w:p>
+            <w:pPr>
+              <w:pBdr/>
+              <w:spacing w:line="312" w:lineRule="auto"/>
+              <w:ind w:right="0" w:firstLine="0" w:left="0"/>
+              <w:jc w:val="center"/>
+              <w:rPr>
+                <w:color w:val="000000"/>
+                <w:sz w:val="28"/>
+                <w:szCs w:val="28"/>
+                <w:highlight w:val="none"/>
+              </w:rPr>
+            </w:pPr>
+            <w:r>
+              <w:rPr>
+                <w:color w:val="000000"/>
+                <w:sz w:val="28"/>
+                <w:szCs w:val="28"/>
+                <w:highlight w:val="none"/>
+                <w:lang w:val="en-US"/>
+              </w:rPr>
+              <w:t xml:space="preserve">0x37</w:t>
+            </w:r>
+            <w:r>
+              <w:rPr>
+                <w:color w:val="000000"/>
+                <w:sz w:val="28"/>
+                <w:szCs w:val="28"/>
+                <w:highlight w:val="none"/>
+              </w:rPr>
+            </w:r>
+          </w:p>
+        </w:tc>
+      </w:tr>
+      <w:tr>
+        <w:trPr/>
+        <w:tc>
+          <w:tcPr>
+            <w:tcBorders/>
+            <w:tcW w:w="2416" w:type="dxa"/>
+            <w:vMerge w:val="restart"/>
+          </w:tcPr>
+          <w:p>
+            <w:pPr>
+              <w:pBdr/>
+              <w:spacing w:line="312" w:lineRule="auto"/>
+              <w:ind w:right="0" w:firstLine="0" w:left="0"/>
+              <w:jc w:val="center"/>
+              <w:rPr>
+                <w:color w:val="000000"/>
+                <w:sz w:val="28"/>
+                <w:szCs w:val="28"/>
+                <w:highlight w:val="none"/>
+              </w:rPr>
+            </w:pPr>
+            <w:r>
+              <w:rPr>
+                <w:color w:val="000000"/>
+                <w:sz w:val="28"/>
+                <w:szCs w:val="28"/>
+                <w:highlight w:val="none"/>
+              </w:rPr>
+              <w:t xml:space="preserve">8</w:t>
+            </w:r>
+            <w:r>
+              <w:rPr>
+                <w:color w:val="000000"/>
+                <w:sz w:val="28"/>
+                <w:szCs w:val="28"/>
+                <w:highlight w:val="none"/>
+              </w:rPr>
+            </w:r>
+          </w:p>
+        </w:tc>
+        <w:tc>
+          <w:tcPr>
+            <w:tcBorders/>
+            <w:tcW w:w="7053" w:type="dxa"/>
+            <w:vMerge w:val="restart"/>
+          </w:tcPr>
+          <w:p>
+            <w:pPr>
+              <w:pBdr/>
+              <w:spacing w:line="312" w:lineRule="auto"/>
+              <w:ind w:right="0" w:firstLine="0" w:left="0"/>
+              <w:jc w:val="center"/>
+              <w:rPr>
+                <w:color w:val="000000"/>
+                <w:sz w:val="28"/>
+                <w:szCs w:val="28"/>
+                <w:highlight w:val="none"/>
+              </w:rPr>
+            </w:pPr>
+            <w:r>
+              <w:rPr>
+                <w:color w:val="000000"/>
+                <w:sz w:val="28"/>
+                <w:szCs w:val="28"/>
+                <w:highlight w:val="none"/>
+                <w:lang w:val="en-US"/>
+              </w:rPr>
+              <w:t xml:space="preserve">0x38</w:t>
+            </w:r>
+            <w:r>
+              <w:rPr>
+                <w:color w:val="000000"/>
+                <w:sz w:val="28"/>
+                <w:szCs w:val="28"/>
+                <w:highlight w:val="none"/>
+              </w:rPr>
+            </w:r>
+          </w:p>
+        </w:tc>
+      </w:tr>
+      <w:tr>
+        <w:trPr/>
+        <w:tc>
+          <w:tcPr>
+            <w:tcBorders/>
+            <w:tcW w:w="2416" w:type="dxa"/>
+            <w:vMerge w:val="restart"/>
+          </w:tcPr>
+          <w:p>
+            <w:pPr>
+              <w:pBdr/>
+              <w:spacing w:line="312" w:lineRule="auto"/>
+              <w:ind w:right="0" w:firstLine="0" w:left="0"/>
+              <w:jc w:val="center"/>
+              <w:rPr>
+                <w:color w:val="000000"/>
+                <w:sz w:val="28"/>
+                <w:szCs w:val="28"/>
+                <w:highlight w:val="none"/>
+              </w:rPr>
+            </w:pPr>
+            <w:r>
+              <w:rPr>
+                <w:color w:val="000000"/>
+                <w:sz w:val="28"/>
+                <w:szCs w:val="28"/>
+                <w:highlight w:val="none"/>
+              </w:rPr>
+              <w:t xml:space="preserve">9</w:t>
+            </w:r>
+            <w:r>
+              <w:rPr>
+                <w:color w:val="000000"/>
+                <w:sz w:val="28"/>
+                <w:szCs w:val="28"/>
+                <w:highlight w:val="none"/>
+              </w:rPr>
+            </w:r>
+          </w:p>
+        </w:tc>
+        <w:tc>
+          <w:tcPr>
+            <w:tcBorders/>
+            <w:tcW w:w="7053" w:type="dxa"/>
+            <w:vMerge w:val="restart"/>
+          </w:tcPr>
+          <w:p>
+            <w:pPr>
+              <w:pBdr/>
+              <w:spacing w:line="312" w:lineRule="auto"/>
+              <w:ind w:right="0" w:firstLine="0" w:left="0"/>
+              <w:jc w:val="center"/>
+              <w:rPr>
+                <w:color w:val="000000"/>
+                <w:sz w:val="28"/>
+                <w:szCs w:val="28"/>
+                <w:highlight w:val="none"/>
+              </w:rPr>
+            </w:pPr>
+            <w:r>
+              <w:rPr>
+                <w:color w:val="000000"/>
+                <w:sz w:val="28"/>
+                <w:szCs w:val="28"/>
+                <w:highlight w:val="none"/>
+                <w:lang w:val="en-US"/>
+              </w:rPr>
+              <w:t xml:space="preserve">0x39</w:t>
+            </w:r>
+            <w:r>
+              <w:rPr>
+                <w:color w:val="000000"/>
+                <w:sz w:val="28"/>
+                <w:szCs w:val="28"/>
+                <w:highlight w:val="none"/>
+              </w:rPr>
+            </w:r>
+          </w:p>
+        </w:tc>
+      </w:tr>
+    </w:tbl>
+    <w:p>
+      <w:pPr>
+        <w:pBdr/>
+        <w:spacing w:line="312" w:lineRule="auto"/>
+        <w:ind w:right="0" w:firstLine="709" w:left="0"/>
+        <w:rPr>
+          <w:color w:val="000000"/>
+          <w:sz w:val="28"/>
+          <w:szCs w:val="28"/>
+        </w:rPr>
+      </w:pPr>
+      <w:r>
+        <w:rPr>
+          <w:color w:val="000000"/>
+          <w:sz w:val="28"/>
+          <w:szCs w:val="28"/>
+          <w:highlight w:val="none"/>
+        </w:rPr>
+      </w:r>
+      <w:r>
+        <w:rPr>
+          <w:color w:val="000000"/>
+          <w:sz w:val="28"/>
+          <w:szCs w:val="28"/>
+          <w:highlight w:val="none"/>
+        </w:rPr>
+      </w:r>
+      <w:r>
+        <w:rPr>
+          <w:color w:val="000000"/>
+          <w:sz w:val="28"/>
+          <w:szCs w:val="28"/>
+          <w:highlight w:val="none"/>
+        </w:rPr>
+      </w:r>
+    </w:p>
+    <w:p>
+      <w:pPr>
+        <w:pBdr/>
+        <w:spacing w:line="312" w:lineRule="auto"/>
         <w:ind/>
         <w:rPr>
           <w14:ligatures w14:val="none"/>
@@ -7124,12 +8154,9 @@
         </w:rPr>
         <w:t xml:space="preserve">об использовании портов ввода/вывода в адаптере дисплея для операции системных пересылок</w:t>
       </w:r>
+      <w:r/>
       <w:bookmarkEnd w:id="6"/>
-      <w:r>
-        <w:rPr>
-          <w14:ligatures w14:val="none"/>
-        </w:rPr>
-      </w:r>
+      <w:r/>
       <w:r>
         <w:rPr>
           <w14:ligatures w14:val="none"/>

</xml_diff>